<commit_message>
Regenerate template Word downloads from current page content
The six .docx files were last generated September 21-22, before the
October 5 page edits. Three still said "Full EHR integration takes 4 to 6
weeks" (now 48 hours), and the vendor evaluation checklist still described
"a fixed platform and integration fee plus a success fee" instead of the
current per-screened-patient fee plus a share of the randomization
milestone payment, with no integration fee. Regenerated with
`npm run gen:docx`.

Co-Authored-By: Claude Opus 5.5 (1M context) <noreply@anthropic.com>
</commit_message>
<xml_diff>
--- a/public/downloads/ai-recruitment-vendor-evaluation-checklist.docx
+++ b/public/downloads/ai-recruitment-vendor-evaluation-checklist.docx
@@ -20,7 +20,7 @@
           <w:sz w:val="18"/>
           <w:szCs w:val="18"/>
         </w:rPr>
-        <w:t xml:space="preserve">Bond Health template · bondtrials.com/templates/ai-recruitment-vendor-evaluation-checklist · Last updated 2026-09-21</w:t>
+        <w:t xml:space="preserve">Bond Health template · bondtrials.com/templates/ai-recruitment-vendor-evaluation-checklist · Last updated 2026-10-05</w:t>
       </w:r>
     </w:p>
     <w:p>
@@ -2568,7 +2568,7 @@
         <w:t xml:space="preserve">Integration.</w:t>
       </w:r>
       <w:r>
-        <w:t xml:space="preserve"> Bond connects through FHIR or HL7 interfaces or an aggregator. Full EHR integration takes 4 to 6 weeks, depending on your EHR, IT review and interface method. See implementation.</w:t>
+        <w:t xml:space="preserve"> Bond connects to all the major EHRs, including Epic, Oracle Health (Cerner), MEDITECH, athenahealth, eClinicalWorks, NextGen, Veradigm and OncoEMR, through FHIR or HL7 interfaces or an aggregator. It also works with the CTMS systems sites use, including CRIO, Advarra OnCore, Advarra Clinical Conductor, RealTime and Veeva SiteVault (Bond is a CRIO Certified Partner). Full EHR integration takes 48 hours, depending on your EHR, IT review and interface method. See implementation.</w:t>
       </w:r>
     </w:p>
     <w:p>
@@ -2588,7 +2588,7 @@
         <w:t xml:space="preserve">Security.</w:t>
       </w:r>
       <w:r>
-        <w:t xml:space="preserve"> Bond signs BAAs and lists its controls on the security page and its Vanta Trust Center.</w:t>
+        <w:t xml:space="preserve"> Bond is HIPAA compliant and SOC 2 Type I compliant, its information security management system is certified to ISO/IEC 27001:2022 by Advantage Partners, and its SOC 2 Type II audit is underway. Bond signs BAAs and lists its controls on the security page and its Vanta Trust Center.</w:t>
       </w:r>
     </w:p>
     <w:p>
@@ -2608,7 +2608,7 @@
         <w:t xml:space="preserve">Disclosure.</w:t>
       </w:r>
       <w:r>
-        <w:t xml:space="preserve"> Engage tells patients that AI assistance is used, and they can ask for a human callback at any time.</w:t>
+        <w:t xml:space="preserve"> Engage tells patients that AI assistance is used, and they can reach a person at any time: the agent transfers the call live to a coordinator or books a human callback, whichever the site prefers.</w:t>
       </w:r>
     </w:p>
     <w:p>
@@ -2628,7 +2628,7 @@
         <w:t xml:space="preserve">Pricing.</w:t>
       </w:r>
       <w:r>
-        <w:t xml:space="preserve"> A fixed platform and integration fee plus a success fee per enrolled patient, where enrolled means randomized. See pricing.</w:t>
+        <w:t xml:space="preserve"> A volume-based fee per screened patient plus a percentage of the randomization milestone payment for each patient. There is no integration fee. See pricing.</w:t>
       </w:r>
     </w:p>
     <w:p>
@@ -2661,7 +2661,7 @@
           <w:sz w:val="18"/>
           <w:szCs w:val="18"/>
         </w:rPr>
-        <w:t xml:space="preserve">2. Terminology Infrastructure and Graph-Grounded RAG for Clinical Trial Patient Matching. Bond Health, preprint, 2026.</w:t>
+        <w:t xml:space="preserve">2. Bond Health product information. Bond Health, 2026. https://bondtrials.com</w:t>
       </w:r>
     </w:p>
     <w:p>
@@ -2673,7 +2673,7 @@
           <w:sz w:val="18"/>
           <w:szCs w:val="18"/>
         </w:rPr>
-        <w:t xml:space="preserve">3. IBM's Watson supercomputer recommended 'unsafe and incorrect' cancer treatments, internal documents show. STAT, 2018. https://www.statnews.com/2018/07/25/ibm-watson-recommended-unsafe-incorrect-treatments/</w:t>
+        <w:t xml:space="preserve">3. Terminology Infrastructure and Graph-Grounded RAG for Clinical Trial Patient Matching. Bond Health, preprint, 2026.</w:t>
       </w:r>
     </w:p>
     <w:p>
@@ -2685,7 +2685,7 @@
           <w:sz w:val="18"/>
           <w:szCs w:val="18"/>
         </w:rPr>
-        <w:t xml:space="preserve">4. TREC 2021 Clinical Trials Track. TREC Clinical Trials Track organizers, 2021. https://www.trec-cds.org/2021.html</w:t>
+        <w:t xml:space="preserve">4. IBM's Watson supercomputer recommended 'unsafe and incorrect' cancer treatments, internal documents show. STAT, 2018. https://www.statnews.com/2018/07/25/ibm-watson-recommended-unsafe-incorrect-treatments/</w:t>
       </w:r>
     </w:p>
     <w:p>
@@ -2697,7 +2697,7 @@
           <w:sz w:val="18"/>
           <w:szCs w:val="18"/>
         </w:rPr>
-        <w:t xml:space="preserve">5. Real-world validation of a multimodal LLM-powered pipeline for high-accuracy clinical trial patient matching. Communications Medicine, 2025. https://pmc.ncbi.nlm.nih.gov/articles/PMC12749220/</w:t>
+        <w:t xml:space="preserve">5. TREC 2021 Clinical Trials Track. TREC Clinical Trials Track organizers, 2021. https://www.trec-cds.org/2021.html</w:t>
       </w:r>
     </w:p>
     <w:p>
@@ -2709,7 +2709,7 @@
           <w:sz w:val="18"/>
           <w:szCs w:val="18"/>
         </w:rPr>
-        <w:t xml:space="preserve">6. Identifying Patients with Heart Failure Eligible for Guideline-Directed Medical Therapy. Population Health Management, 2024. https://pubmed.ncbi.nlm.nih.gov/39630562/</w:t>
+        <w:t xml:space="preserve">6. Real-world validation of a multimodal LLM-powered pipeline for high-accuracy clinical trial patient matching. Communications Medicine, 2025. https://pmc.ncbi.nlm.nih.gov/articles/PMC12749220/</w:t>
       </w:r>
     </w:p>
     <w:p>
@@ -2721,7 +2721,7 @@
           <w:sz w:val="18"/>
           <w:szCs w:val="18"/>
         </w:rPr>
-        <w:t xml:space="preserve">7. Sociodemographic bias in large language model clinical trial screening. Journal of the American Medical Informatics Association, 2026. https://pubmed.ncbi.nlm.nih.gov/42118957/</w:t>
+        <w:t xml:space="preserve">7. Identifying Patients with Heart Failure Eligible for Guideline-Directed Medical Therapy. Population Health Management, 2024. https://pubmed.ncbi.nlm.nih.gov/39630562/</w:t>
       </w:r>
     </w:p>
     <w:p>
@@ -2733,7 +2733,7 @@
           <w:sz w:val="18"/>
           <w:szCs w:val="18"/>
         </w:rPr>
-        <w:t xml:space="preserve">8. Health Data, Technology, and Interoperability: Certification Program Updates, Algorithm Transparency, and Information Sharing (HTI-1) Final Rule, 89 FR 1192. Federal Register / HHS Office of the National Coordinator for Health IT, 2024. https://www.govinfo.gov/content/pkg/FR-2024-01-09/html/2023-28857.htm</w:t>
+        <w:t xml:space="preserve">8. Sociodemographic bias in large language model clinical trial screening. Journal of the American Medical Informatics Association, 2026. https://pubmed.ncbi.nlm.nih.gov/42118957/</w:t>
       </w:r>
     </w:p>
     <w:p>
@@ -2745,7 +2745,7 @@
           <w:sz w:val="18"/>
           <w:szCs w:val="18"/>
         </w:rPr>
-        <w:t xml:space="preserve">9. 45 CFR 170.315(b)(11) Decision support interventions. eCFR (Office of the Federal Register / GPO), 2026. https://www.ecfr.gov/current/title-45/section-170.315</w:t>
+        <w:t xml:space="preserve">9. Health Data, Technology, and Interoperability: Certification Program Updates, Algorithm Transparency, and Information Sharing (HTI-1) Final Rule, 89 FR 1192. Federal Register / HHS Office of the National Coordinator for Health IT, 2024. https://www.govinfo.gov/content/pkg/FR-2024-01-09/html/2023-28857.htm</w:t>
       </w:r>
     </w:p>
     <w:p>
@@ -2757,7 +2757,7 @@
           <w:sz w:val="18"/>
           <w:szCs w:val="18"/>
         </w:rPr>
-        <w:t xml:space="preserve">10. Employing computers for the recruitment into clinical trials: a comprehensive systematic review. Journal of Medical Internet Research, 2014. https://pubmed.ncbi.nlm.nih.gov/24985568/</w:t>
+        <w:t xml:space="preserve">10. 45 CFR 170.315(b)(11) Decision support interventions. eCFR (Office of the Federal Register / GPO), 2026. https://www.ecfr.gov/current/title-45/section-170.315</w:t>
       </w:r>
     </w:p>
     <w:p>
@@ -2769,7 +2769,7 @@
           <w:sz w:val="18"/>
           <w:szCs w:val="18"/>
         </w:rPr>
-        <w:t xml:space="preserve">11. Achieving a Major Milestone: Health IT Developers Certify to Cures Update. HealthIT.gov (ASTP/ONC), 2023. https://healthit.gov/blog/interoperability/achieving-a-major-milestone-health-it-developers-certify-to-cures-update/</w:t>
+        <w:t xml:space="preserve">11. Employing computers for the recruitment into clinical trials: a comprehensive systematic review. Journal of Medical Internet Research, 2014. https://pubmed.ncbi.nlm.nih.gov/24985568/</w:t>
       </w:r>
     </w:p>
     <w:p>
@@ -2781,7 +2781,7 @@
           <w:sz w:val="18"/>
           <w:szCs w:val="18"/>
         </w:rPr>
-        <w:t xml:space="preserve">12. 45 CFR 160.103 Definitions (business associate). eCFR (Office of the Federal Register / GPO), 2026. https://www.ecfr.gov/current/title-45/section-160.103</w:t>
+        <w:t xml:space="preserve">12. Achieving a Major Milestone: Health IT Developers Certify to Cures Update. HealthIT.gov (ASTP/ONC), 2023. https://healthit.gov/blog/interoperability/achieving-a-major-milestone-health-it-developers-certify-to-cures-update/</w:t>
       </w:r>
     </w:p>
     <w:p>
@@ -2793,7 +2793,7 @@
           <w:sz w:val="18"/>
           <w:szCs w:val="18"/>
         </w:rPr>
-        <w:t xml:space="preserve">13. 45 CFR 164.504(e) Business associate contracts. eCFR (Office of the Federal Register / GPO), 2026. https://www.ecfr.gov/current/title-45/section-164.504</w:t>
+        <w:t xml:space="preserve">13. 45 CFR 160.103 Definitions (business associate). eCFR (Office of the Federal Register / GPO), 2026. https://www.ecfr.gov/current/title-45/section-160.103</w:t>
       </w:r>
     </w:p>
     <w:p>
@@ -2805,7 +2805,7 @@
           <w:sz w:val="18"/>
           <w:szCs w:val="18"/>
         </w:rPr>
-        <w:t xml:space="preserve">14. 45 CFR 164.512 Uses and disclosures for which an authorization or opportunity to agree or object is not required. eCFR (Office of the Federal Register / GPO), 2026. https://www.ecfr.gov/current/title-45/section-164.512</w:t>
+        <w:t xml:space="preserve">14. 45 CFR 164.504(e) Business associate contracts. eCFR (Office of the Federal Register / GPO), 2026. https://www.ecfr.gov/current/title-45/section-164.504</w:t>
       </w:r>
     </w:p>
     <w:p>
@@ -2817,7 +2817,7 @@
           <w:sz w:val="18"/>
           <w:szCs w:val="18"/>
         </w:rPr>
-        <w:t xml:space="preserve">15. AB-3030 Health care services: artificial intelligence (Chapter 848, Statutes of 2024). California Legislative Information, 2024. https://leginfo.legislature.ca.gov/faces/billTextClient.xhtml?bill_id=202320240AB3030</w:t>
+        <w:t xml:space="preserve">15. 45 CFR 164.512 Uses and disclosures for which an authorization or opportunity to agree or object is not required. eCFR (Office of the Federal Register / GPO), 2026. https://www.ecfr.gov/current/title-45/section-164.512</w:t>
       </w:r>
     </w:p>
     <w:p>
@@ -2829,7 +2829,7 @@
           <w:sz w:val="18"/>
           <w:szCs w:val="18"/>
         </w:rPr>
-        <w:t xml:space="preserve">16. H.B. No. 149, Texas Responsible Artificial Intelligence Governance Act (enrolled). Texas Legislature Online, 2025. https://capitol.texas.gov/tlodocs/89R/billtext/html/HB00149F.htm</w:t>
+        <w:t xml:space="preserve">16. AB-3030 Health care services: artificial intelligence (Chapter 848, Statutes of 2024). California Legislative Information, 2024. https://leginfo.legislature.ca.gov/faces/billTextClient.xhtml?bill_id=202320240AB3030</w:t>
       </w:r>
     </w:p>
     <w:p>
@@ -2841,7 +2841,7 @@
           <w:sz w:val="18"/>
           <w:szCs w:val="18"/>
         </w:rPr>
-        <w:t xml:space="preserve">17. Recruiting Study Subjects: Guidance for Institutional Review Boards and Clinical Investigators. U.S. Food and Drug Administration, 1998. https://www.fda.gov/regulatory-information/search-fda-guidance-documents/recruiting-study-subjects</w:t>
+        <w:t xml:space="preserve">17. H.B. No. 149, Texas Responsible Artificial Intelligence Governance Act (enrolled). Texas Legislature Online, 2025. https://capitol.texas.gov/tlodocs/89R/billtext/html/HB00149F.htm</w:t>
       </w:r>
     </w:p>
     <w:p>
@@ -2853,7 +2853,7 @@
           <w:sz w:val="18"/>
           <w:szCs w:val="18"/>
         </w:rPr>
-        <w:t xml:space="preserve">18. ICH Harmonised Guideline: Guideline for Good Clinical Practice E6(R3). International Council for Harmonisation, 2025. https://database.ich.org/sites/default/files/ICH_E6%28R3%29_Step4_FinalGuideline_2025_0106.pdf</w:t>
+        <w:t xml:space="preserve">18. Recruiting Study Subjects: Guidance for Institutional Review Boards and Clinical Investigators. U.S. Food and Drug Administration, 1998. https://www.fda.gov/regulatory-information/search-fda-guidance-documents/recruiting-study-subjects</w:t>
       </w:r>
     </w:p>
     <w:p>
@@ -2865,7 +2865,7 @@
           <w:sz w:val="18"/>
           <w:szCs w:val="18"/>
         </w:rPr>
-        <w:t xml:space="preserve">19. 21 CFR 56.111 Criteria for IRB approval of research. eCFR (Office of the Federal Register / GPO), 2026. https://www.ecfr.gov/current/title-21/section-56.111</w:t>
+        <w:t xml:space="preserve">19. ICH Harmonised Guideline: Guideline for Good Clinical Practice E6(R3). International Council for Harmonisation, 2025. https://database.ich.org/sites/default/files/ICH_E6%28R3%29_Step4_FinalGuideline_2025_0106.pdf</w:t>
       </w:r>
     </w:p>
     <w:p>
@@ -2877,7 +2877,7 @@
           <w:sz w:val="18"/>
           <w:szCs w:val="18"/>
         </w:rPr>
-        <w:t xml:space="preserve">20. Considerations for the Use of Artificial Intelligence to Support Regulatory Decision-Making for Drug and Biological Products (draft guidance). U.S. Food and Drug Administration, 2025. https://www.fda.gov/media/184830/download</w:t>
+        <w:t xml:space="preserve">20. 21 CFR 56.111 Criteria for IRB approval of research. eCFR (Office of the Federal Register / GPO), 2026. https://www.ecfr.gov/current/title-21/section-56.111</w:t>
       </w:r>
     </w:p>
     <w:p>
@@ -2889,7 +2889,19 @@
           <w:sz w:val="18"/>
           <w:szCs w:val="18"/>
         </w:rPr>
-        <w:t xml:space="preserve">21. FDA Proposes Framework to Advance Credibility of AI Models Used for Drug and Biological Product Submissions. U.S. Food and Drug Administration, 2025. https://www.fda.gov/news-events/press-announcements/fda-proposes-framework-advance-credibility-ai-models-used-drug-and-biological-product-submissions</w:t>
+        <w:t xml:space="preserve">21. Considerations for the Use of Artificial Intelligence to Support Regulatory Decision-Making for Drug and Biological Products (draft guidance). U.S. Food and Drug Administration, 2025. https://www.fda.gov/media/184830/download</w:t>
+      </w:r>
+    </w:p>
+    <w:p>
+      <w:pPr>
+        <w:spacing w:after="60"/>
+      </w:pPr>
+      <w:r>
+        <w:rPr>
+          <w:sz w:val="18"/>
+          <w:szCs w:val="18"/>
+        </w:rPr>
+        <w:t xml:space="preserve">22. FDA Proposes Framework to Advance Credibility of AI Models Used for Drug and Biological Product Submissions. U.S. Food and Drug Administration, 2025. https://www.fda.gov/news-events/press-announcements/fda-proposes-framework-advance-credibility-ai-models-used-drug-and-biological-product-submissions</w:t>
       </w:r>
     </w:p>
     <w:p>

</xml_diff>

<commit_message>
Pricing: share of every milestone payment from randomization on
Bond's variable fee is a percentage of each randomized patient's
milestone payments: the randomization payment and every later visit
payment the patient reaches. The site said it was only the
randomization milestone. Nothing changes before randomization, so
"owed only for randomized patients" still holds.

- Standard wording across pages, homepage, JSON-LD and llms.txt
- Pricing page and homepage card explain later visits count
- "Randomization share" renamed "milestone share"
- Vendor checklist docx regenerated; lastUpdated bumped where body text changed

Co-Authored-By: Claude Opus 5.5 (1M context) <noreply@anthropic.com>
</commit_message>
<xml_diff>
--- a/public/downloads/ai-recruitment-vendor-evaluation-checklist.docx
+++ b/public/downloads/ai-recruitment-vendor-evaluation-checklist.docx
@@ -20,7 +20,7 @@
           <w:sz w:val="18"/>
           <w:szCs w:val="18"/>
         </w:rPr>
-        <w:t xml:space="preserve">Bond Health template · bondtrials.com/templates/ai-recruitment-vendor-evaluation-checklist · Last updated 2026-10-23</w:t>
+        <w:t xml:space="preserve">Bond Health template · bondtrials.com/templates/ai-recruitment-vendor-evaluation-checklist · Last updated 2026-10-29</w:t>
       </w:r>
     </w:p>
     <w:p>
@@ -2628,7 +2628,7 @@
         <w:t xml:space="preserve">Pricing.</w:t>
       </w:r>
       <w:r>
-        <w:t xml:space="preserve"> A volume-based fee per screened patient plus a percentage of the randomization milestone payment for each patient. There is no integration fee. See pricing.</w:t>
+        <w:t xml:space="preserve"> A volume-based fee per screened patient plus a percentage of each randomized patient's milestone payments, from randomization onward. There is no integration fee. See pricing.</w:t>
       </w:r>
     </w:p>
     <w:p>

</xml_diff>